<commit_message>
fix: DOCX template with Qté+Total columns, XLSX with SUM formulas for totals
- DOCX: Replace 2-column pricing table (Service | Prix unitaire) with
  4-column table (Service | Quantité | P.U. HT | Total HT) plus 5 data
  rows and Total HT / TVA / Total TTC summary rows with styling
- XLSX: Add Excel formulas (SUM, multiplication) in E13:E15 for
  auto-computed Total HT, TVA 20%, and Total TTC

Co-Authored-By: Claude Opus 4.6 (1M context) <noreply@anthropic.com>
</commit_message>
<xml_diff>
--- a/example-vault/templates/lincloud-proposition.docx
+++ b/example-vault/templates/lincloud-proposition.docx
@@ -4,12 +4,7 @@
   <w:body>
     <w:p>
       <w:pPr>
-        <w:spacing w:before="2000"/>
-      </w:pPr>
-    </w:p>
-    <w:p>
-      <w:pPr>
-        <w:spacing w:after="100"/>
+        <w:spacing w:after="200"/>
         <w:jc w:val="center"/>
       </w:pPr>
       <w:r>
@@ -17,31 +12,15 @@
           <w:b/>
           <w:bCs/>
           <w:color w:val="2B579A"/>
-          <w:sz w:val="56"/>
-          <w:szCs w:val="56"/>
-        </w:rPr>
-        <w:t xml:space="preserve">PROPOSITION</w:t>
-      </w:r>
-    </w:p>
-    <w:p>
-      <w:pPr>
-        <w:spacing w:after="400"/>
-        <w:jc w:val="center"/>
-      </w:pPr>
-      <w:r>
-        <w:rPr>
-          <w:b/>
-          <w:bCs/>
-          <w:color w:val="2B579A"/>
-          <w:sz w:val="44"/>
-          <w:szCs w:val="44"/>
-        </w:rPr>
-        <w:t xml:space="preserve">LinCloud Souverain</w:t>
-      </w:r>
-    </w:p>
-    <w:p>
-      <w:pPr>
-        <w:spacing w:after="200"/>
+          <w:sz w:val="48"/>
+          <w:szCs w:val="48"/>
+        </w:rPr>
+        <w:t xml:space="preserve">Proposition LinCloud Souverain</w:t>
+      </w:r>
+    </w:p>
+    <w:p>
+      <w:pPr>
+        <w:spacing w:after="100"/>
         <w:jc w:val="center"/>
       </w:pPr>
       <w:r>
@@ -54,7 +33,7 @@
     </w:p>
     <w:p>
       <w:pPr>
-        <w:spacing w:after="200"/>
+        <w:spacing w:after="400"/>
         <w:jc w:val="center"/>
       </w:pPr>
       <w:r>
@@ -69,29 +48,7 @@
     </w:p>
     <w:p>
       <w:pPr>
-        <w:spacing w:after="2000"/>
-        <w:jc w:val="center"/>
-      </w:pPr>
-      <w:r>
-        <w:rPr>
-          <w:b/>
-          <w:bCs/>
-          <w:color w:val="666666"/>
-          <w:sz w:val="22"/>
-          <w:szCs w:val="22"/>
-        </w:rPr>
-        <w:t xml:space="preserve">LINAGORA</w:t>
-      </w:r>
-    </w:p>
-    <w:p>
-      <w:r>
-        <w:br w:type="page"/>
-      </w:r>
-    </w:p>
-    <w:p>
-      <w:pPr>
         <w:pStyle w:val="Heading1"/>
-        <w:spacing w:after="200"/>
       </w:pPr>
       <w:r>
         <w:rPr>
@@ -99,12 +56,12 @@
           <w:bCs/>
           <w:color w:val="2B579A"/>
         </w:rPr>
-        <w:t xml:space="preserve">1. Contexte</w:t>
-      </w:r>
-    </w:p>
-    <w:p>
-      <w:pPr>
-        <w:spacing w:after="400"/>
+        <w:t xml:space="preserve">Contexte</w:t>
+      </w:r>
+    </w:p>
+    <w:p>
+      <w:pPr>
+        <w:spacing w:after="300"/>
       </w:pPr>
       <w:r>
         <w:rPr>
@@ -117,7 +74,7 @@
     <w:p>
       <w:pPr>
         <w:pStyle w:val="Heading1"/>
-        <w:spacing w:after="200" w:before="400"/>
+        <w:spacing w:before="300"/>
       </w:pPr>
       <w:r>
         <w:rPr>
@@ -125,7 +82,7 @@
           <w:bCs/>
           <w:color w:val="2B579A"/>
         </w:rPr>
-        <w:t xml:space="preserve">2. Notre solution</w:t>
+        <w:t xml:space="preserve">Notre solution</w:t>
       </w:r>
     </w:p>
     <w:p>
@@ -146,7 +103,6 @@
         <w:rPr>
           <w:b/>
           <w:bCs/>
-          <w:color w:val="2B579A"/>
           <w:sz w:val="22"/>
           <w:szCs w:val="22"/>
         </w:rPr>
@@ -155,7 +111,7 @@
     </w:p>
     <w:p>
       <w:pPr>
-        <w:spacing w:after="300"/>
+        <w:spacing w:after="200"/>
       </w:pPr>
       <w:r>
         <w:rPr>
@@ -176,14 +132,9 @@
       </w:r>
     </w:p>
     <w:p>
-      <w:r>
-        <w:br w:type="page"/>
-      </w:r>
-    </w:p>
-    <w:p>
       <w:pPr>
         <w:pStyle w:val="Heading1"/>
-        <w:spacing w:after="200"/>
+        <w:spacing w:after="200" w:before="400"/>
       </w:pPr>
       <w:r>
         <w:rPr>
@@ -191,19 +142,7 @@
           <w:bCs/>
           <w:color w:val="2B579A"/>
         </w:rPr>
-        <w:t xml:space="preserve">3. Tarification</w:t>
-      </w:r>
-    </w:p>
-    <w:p>
-      <w:pPr>
-        <w:spacing w:after="200"/>
-      </w:pPr>
-      <w:r>
-        <w:rPr>
-          <w:sz w:val="22"/>
-          <w:szCs w:val="22"/>
-        </w:rPr>
-        <w:t xml:space="preserve">Modèle pay-as-you-go avec engagement annuel.</w:t>
+        <w:t xml:space="preserve">Tarification</w:t>
       </w:r>
     </w:p>
     <w:tbl>
@@ -221,11 +160,12 @@
       <w:tblGrid>
         <w:gridCol w:w="100"/>
         <w:gridCol w:w="100"/>
+        <w:gridCol w:w="100"/>
+        <w:gridCol w:w="100"/>
       </w:tblGrid>
       <w:tr>
         <w:tc>
           <w:tcPr>
-            <w:tcW w:type="dxa" w:w="5000"/>
             <w:tcBorders>
               <w:top w:val="single" w:color="CCCCCC" w:sz="1"/>
               <w:left w:val="single" w:color="CCCCCC" w:sz="1"/>
@@ -235,6 +175,9 @@
             <w:shd w:color="2B579A" w:val="solid"/>
           </w:tcPr>
           <w:p>
+            <w:pPr>
+              <w:jc w:val="center"/>
+            </w:pPr>
             <w:r>
               <w:rPr>
                 <w:b/>
@@ -249,7 +192,6 @@
         </w:tc>
         <w:tc>
           <w:tcPr>
-            <w:tcW w:type="dxa" w:w="4500"/>
             <w:tcBorders>
               <w:top w:val="single" w:color="CCCCCC" w:sz="1"/>
               <w:left w:val="single" w:color="CCCCCC" w:sz="1"/>
@@ -260,7 +202,7 @@
           </w:tcPr>
           <w:p>
             <w:pPr>
-              <w:jc w:val="right"/>
+              <w:jc w:val="center"/>
             </w:pPr>
             <w:r>
               <w:rPr>
@@ -270,7 +212,59 @@
                 <w:sz w:val="20"/>
                 <w:szCs w:val="20"/>
               </w:rPr>
-              <w:t xml:space="preserve">Prix unitaire</w:t>
+              <w:t xml:space="preserve">Quantité</w:t>
+            </w:r>
+          </w:p>
+        </w:tc>
+        <w:tc>
+          <w:tcPr>
+            <w:tcBorders>
+              <w:top w:val="single" w:color="CCCCCC" w:sz="1"/>
+              <w:left w:val="single" w:color="CCCCCC" w:sz="1"/>
+              <w:bottom w:val="single" w:color="CCCCCC" w:sz="1"/>
+              <w:right w:val="single" w:color="CCCCCC" w:sz="1"/>
+            </w:tcBorders>
+            <w:shd w:color="2B579A" w:val="solid"/>
+          </w:tcPr>
+          <w:p>
+            <w:pPr>
+              <w:jc w:val="center"/>
+            </w:pPr>
+            <w:r>
+              <w:rPr>
+                <w:b/>
+                <w:bCs/>
+                <w:color w:val="FFFFFF"/>
+                <w:sz w:val="20"/>
+                <w:szCs w:val="20"/>
+              </w:rPr>
+              <w:t xml:space="preserve">P.U. HT</w:t>
+            </w:r>
+          </w:p>
+        </w:tc>
+        <w:tc>
+          <w:tcPr>
+            <w:tcBorders>
+              <w:top w:val="single" w:color="CCCCCC" w:sz="1"/>
+              <w:left w:val="single" w:color="CCCCCC" w:sz="1"/>
+              <w:bottom w:val="single" w:color="CCCCCC" w:sz="1"/>
+              <w:right w:val="single" w:color="CCCCCC" w:sz="1"/>
+            </w:tcBorders>
+            <w:shd w:color="2B579A" w:val="solid"/>
+          </w:tcPr>
+          <w:p>
+            <w:pPr>
+              <w:jc w:val="center"/>
+            </w:pPr>
+            <w:r>
+              <w:rPr>
+                <w:b/>
+                <w:bCs/>
+                <w:color w:val="FFFFFF"/>
+                <w:sz w:val="20"/>
+                <w:szCs w:val="20"/>
+              </w:rPr>
+              <w:t xml:space="preserve">Total HT</w:t>
             </w:r>
           </w:p>
         </w:tc>
@@ -286,34 +280,89 @@
             </w:tcBorders>
           </w:tcPr>
           <w:p>
-            <w:r>
-              <w:rPr>
-                <w:sz w:val="22"/>
-                <w:szCs w:val="22"/>
-              </w:rPr>
-              <w:t xml:space="preserve">Compute (vCPU)</w:t>
-            </w:r>
-          </w:p>
-        </w:tc>
-        <w:tc>
-          <w:tcPr>
-            <w:tcBorders>
-              <w:top w:val="single" w:color="CCCCCC" w:sz="1"/>
-              <w:left w:val="single" w:color="CCCCCC" w:sz="1"/>
-              <w:bottom w:val="single" w:color="CCCCCC" w:sz="1"/>
-              <w:right w:val="single" w:color="CCCCCC" w:sz="1"/>
-            </w:tcBorders>
-          </w:tcPr>
-          <w:p>
-            <w:pPr>
-              <w:jc w:val="right"/>
-            </w:pPr>
-            <w:r>
-              <w:rPr>
-                <w:sz w:val="22"/>
-                <w:szCs w:val="22"/>
-              </w:rPr>
-              <w:t xml:space="preserve">0,025 €/heure</w:t>
+            <w:pPr>
+              <w:jc w:val="left"/>
+            </w:pPr>
+            <w:r>
+              <w:rPr>
+                <w:b w:val="false"/>
+                <w:bCs w:val="false"/>
+                <w:sz w:val="20"/>
+                <w:szCs w:val="20"/>
+              </w:rPr>
+              <w:t xml:space="preserve">Compute vCPU</w:t>
+            </w:r>
+          </w:p>
+        </w:tc>
+        <w:tc>
+          <w:tcPr>
+            <w:tcBorders>
+              <w:top w:val="single" w:color="CCCCCC" w:sz="1"/>
+              <w:left w:val="single" w:color="CCCCCC" w:sz="1"/>
+              <w:bottom w:val="single" w:color="CCCCCC" w:sz="1"/>
+              <w:right w:val="single" w:color="CCCCCC" w:sz="1"/>
+            </w:tcBorders>
+          </w:tcPr>
+          <w:p>
+            <w:pPr>
+              <w:jc w:val="center"/>
+            </w:pPr>
+            <w:r>
+              <w:rPr>
+                <w:b w:val="false"/>
+                <w:bCs w:val="false"/>
+                <w:sz w:val="20"/>
+                <w:szCs w:val="20"/>
+              </w:rPr>
+              <w:t xml:space="preserve">100</w:t>
+            </w:r>
+          </w:p>
+        </w:tc>
+        <w:tc>
+          <w:tcPr>
+            <w:tcBorders>
+              <w:top w:val="single" w:color="CCCCCC" w:sz="1"/>
+              <w:left w:val="single" w:color="CCCCCC" w:sz="1"/>
+              <w:bottom w:val="single" w:color="CCCCCC" w:sz="1"/>
+              <w:right w:val="single" w:color="CCCCCC" w:sz="1"/>
+            </w:tcBorders>
+          </w:tcPr>
+          <w:p>
+            <w:pPr>
+              <w:jc w:val="right"/>
+            </w:pPr>
+            <w:r>
+              <w:rPr>
+                <w:b w:val="false"/>
+                <w:bCs w:val="false"/>
+                <w:sz w:val="20"/>
+                <w:szCs w:val="20"/>
+              </w:rPr>
+              <w:t xml:space="preserve">0,025 €/h</w:t>
+            </w:r>
+          </w:p>
+        </w:tc>
+        <w:tc>
+          <w:tcPr>
+            <w:tcBorders>
+              <w:top w:val="single" w:color="CCCCCC" w:sz="1"/>
+              <w:left w:val="single" w:color="CCCCCC" w:sz="1"/>
+              <w:bottom w:val="single" w:color="CCCCCC" w:sz="1"/>
+              <w:right w:val="single" w:color="CCCCCC" w:sz="1"/>
+            </w:tcBorders>
+          </w:tcPr>
+          <w:p>
+            <w:pPr>
+              <w:jc w:val="right"/>
+            </w:pPr>
+            <w:r>
+              <w:rPr>
+                <w:b w:val="false"/>
+                <w:bCs w:val="false"/>
+                <w:sz w:val="20"/>
+                <w:szCs w:val="20"/>
+              </w:rPr>
+              <w:t xml:space="preserve">2,50 €</w:t>
             </w:r>
           </w:p>
         </w:tc>
@@ -329,10 +378,15 @@
             </w:tcBorders>
           </w:tcPr>
           <w:p>
-            <w:r>
-              <w:rPr>
-                <w:sz w:val="22"/>
-                <w:szCs w:val="22"/>
+            <w:pPr>
+              <w:jc w:val="left"/>
+            </w:pPr>
+            <w:r>
+              <w:rPr>
+                <w:b w:val="false"/>
+                <w:bCs w:val="false"/>
+                <w:sz w:val="20"/>
+                <w:szCs w:val="20"/>
               </w:rPr>
               <w:t xml:space="preserve">Stockage objet S3</w:t>
             </w:r>
@@ -349,14 +403,64 @@
           </w:tcPr>
           <w:p>
             <w:pPr>
-              <w:jc w:val="right"/>
-            </w:pPr>
-            <w:r>
-              <w:rPr>
-                <w:sz w:val="22"/>
-                <w:szCs w:val="22"/>
+              <w:jc w:val="center"/>
+            </w:pPr>
+            <w:r>
+              <w:rPr>
+                <w:b w:val="false"/>
+                <w:bCs w:val="false"/>
+                <w:sz w:val="20"/>
+                <w:szCs w:val="20"/>
+              </w:rPr>
+              <w:t xml:space="preserve">5 000 Go</w:t>
+            </w:r>
+          </w:p>
+        </w:tc>
+        <w:tc>
+          <w:tcPr>
+            <w:tcBorders>
+              <w:top w:val="single" w:color="CCCCCC" w:sz="1"/>
+              <w:left w:val="single" w:color="CCCCCC" w:sz="1"/>
+              <w:bottom w:val="single" w:color="CCCCCC" w:sz="1"/>
+              <w:right w:val="single" w:color="CCCCCC" w:sz="1"/>
+            </w:tcBorders>
+          </w:tcPr>
+          <w:p>
+            <w:pPr>
+              <w:jc w:val="right"/>
+            </w:pPr>
+            <w:r>
+              <w:rPr>
+                <w:b w:val="false"/>
+                <w:bCs w:val="false"/>
+                <w:sz w:val="20"/>
+                <w:szCs w:val="20"/>
               </w:rPr>
               <w:t xml:space="preserve">0,008 €/Go/mois</w:t>
+            </w:r>
+          </w:p>
+        </w:tc>
+        <w:tc>
+          <w:tcPr>
+            <w:tcBorders>
+              <w:top w:val="single" w:color="CCCCCC" w:sz="1"/>
+              <w:left w:val="single" w:color="CCCCCC" w:sz="1"/>
+              <w:bottom w:val="single" w:color="CCCCCC" w:sz="1"/>
+              <w:right w:val="single" w:color="CCCCCC" w:sz="1"/>
+            </w:tcBorders>
+          </w:tcPr>
+          <w:p>
+            <w:pPr>
+              <w:jc w:val="right"/>
+            </w:pPr>
+            <w:r>
+              <w:rPr>
+                <w:b w:val="false"/>
+                <w:bCs w:val="false"/>
+                <w:sz w:val="20"/>
+                <w:szCs w:val="20"/>
+              </w:rPr>
+              <w:t xml:space="preserve">40,00 €</w:t>
             </w:r>
           </w:p>
         </w:tc>
@@ -372,10 +476,15 @@
             </w:tcBorders>
           </w:tcPr>
           <w:p>
-            <w:r>
-              <w:rPr>
-                <w:sz w:val="22"/>
-                <w:szCs w:val="22"/>
+            <w:pPr>
+              <w:jc w:val="left"/>
+            </w:pPr>
+            <w:r>
+              <w:rPr>
+                <w:b w:val="false"/>
+                <w:bCs w:val="false"/>
+                <w:sz w:val="20"/>
+                <w:szCs w:val="20"/>
               </w:rPr>
               <w:t xml:space="preserve">Stockage bloc SSD</w:t>
             </w:r>
@@ -392,14 +501,64 @@
           </w:tcPr>
           <w:p>
             <w:pPr>
-              <w:jc w:val="right"/>
-            </w:pPr>
-            <w:r>
-              <w:rPr>
-                <w:sz w:val="22"/>
-                <w:szCs w:val="22"/>
+              <w:jc w:val="center"/>
+            </w:pPr>
+            <w:r>
+              <w:rPr>
+                <w:b w:val="false"/>
+                <w:bCs w:val="false"/>
+                <w:sz w:val="20"/>
+                <w:szCs w:val="20"/>
+              </w:rPr>
+              <w:t xml:space="preserve">2 000 Go</w:t>
+            </w:r>
+          </w:p>
+        </w:tc>
+        <w:tc>
+          <w:tcPr>
+            <w:tcBorders>
+              <w:top w:val="single" w:color="CCCCCC" w:sz="1"/>
+              <w:left w:val="single" w:color="CCCCCC" w:sz="1"/>
+              <w:bottom w:val="single" w:color="CCCCCC" w:sz="1"/>
+              <w:right w:val="single" w:color="CCCCCC" w:sz="1"/>
+            </w:tcBorders>
+          </w:tcPr>
+          <w:p>
+            <w:pPr>
+              <w:jc w:val="right"/>
+            </w:pPr>
+            <w:r>
+              <w:rPr>
+                <w:b w:val="false"/>
+                <w:bCs w:val="false"/>
+                <w:sz w:val="20"/>
+                <w:szCs w:val="20"/>
               </w:rPr>
               <w:t xml:space="preserve">0,12 €/Go/mois</w:t>
+            </w:r>
+          </w:p>
+        </w:tc>
+        <w:tc>
+          <w:tcPr>
+            <w:tcBorders>
+              <w:top w:val="single" w:color="CCCCCC" w:sz="1"/>
+              <w:left w:val="single" w:color="CCCCCC" w:sz="1"/>
+              <w:bottom w:val="single" w:color="CCCCCC" w:sz="1"/>
+              <w:right w:val="single" w:color="CCCCCC" w:sz="1"/>
+            </w:tcBorders>
+          </w:tcPr>
+          <w:p>
+            <w:pPr>
+              <w:jc w:val="right"/>
+            </w:pPr>
+            <w:r>
+              <w:rPr>
+                <w:b w:val="false"/>
+                <w:bCs w:val="false"/>
+                <w:sz w:val="20"/>
+                <w:szCs w:val="20"/>
+              </w:rPr>
+              <w:t xml:space="preserve">240,00 €</w:t>
             </w:r>
           </w:p>
         </w:tc>
@@ -415,34 +574,89 @@
             </w:tcBorders>
           </w:tcPr>
           <w:p>
-            <w:r>
-              <w:rPr>
-                <w:sz w:val="22"/>
-                <w:szCs w:val="22"/>
-              </w:rPr>
-              <w:t xml:space="preserve">Transfert réseau sortant</w:t>
-            </w:r>
-          </w:p>
-        </w:tc>
-        <w:tc>
-          <w:tcPr>
-            <w:tcBorders>
-              <w:top w:val="single" w:color="CCCCCC" w:sz="1"/>
-              <w:left w:val="single" w:color="CCCCCC" w:sz="1"/>
-              <w:bottom w:val="single" w:color="CCCCCC" w:sz="1"/>
-              <w:right w:val="single" w:color="CCCCCC" w:sz="1"/>
-            </w:tcBorders>
-          </w:tcPr>
-          <w:p>
-            <w:pPr>
-              <w:jc w:val="right"/>
-            </w:pPr>
-            <w:r>
-              <w:rPr>
-                <w:sz w:val="22"/>
-                <w:szCs w:val="22"/>
+            <w:pPr>
+              <w:jc w:val="left"/>
+            </w:pPr>
+            <w:r>
+              <w:rPr>
+                <w:b w:val="false"/>
+                <w:bCs w:val="false"/>
+                <w:sz w:val="20"/>
+                <w:szCs w:val="20"/>
+              </w:rPr>
+              <w:t xml:space="preserve">Transfert réseau</w:t>
+            </w:r>
+          </w:p>
+        </w:tc>
+        <w:tc>
+          <w:tcPr>
+            <w:tcBorders>
+              <w:top w:val="single" w:color="CCCCCC" w:sz="1"/>
+              <w:left w:val="single" w:color="CCCCCC" w:sz="1"/>
+              <w:bottom w:val="single" w:color="CCCCCC" w:sz="1"/>
+              <w:right w:val="single" w:color="CCCCCC" w:sz="1"/>
+            </w:tcBorders>
+          </w:tcPr>
+          <w:p>
+            <w:pPr>
+              <w:jc w:val="center"/>
+            </w:pPr>
+            <w:r>
+              <w:rPr>
+                <w:b w:val="false"/>
+                <w:bCs w:val="false"/>
+                <w:sz w:val="20"/>
+                <w:szCs w:val="20"/>
+              </w:rPr>
+              <w:t xml:space="preserve">10 000 Go</w:t>
+            </w:r>
+          </w:p>
+        </w:tc>
+        <w:tc>
+          <w:tcPr>
+            <w:tcBorders>
+              <w:top w:val="single" w:color="CCCCCC" w:sz="1"/>
+              <w:left w:val="single" w:color="CCCCCC" w:sz="1"/>
+              <w:bottom w:val="single" w:color="CCCCCC" w:sz="1"/>
+              <w:right w:val="single" w:color="CCCCCC" w:sz="1"/>
+            </w:tcBorders>
+          </w:tcPr>
+          <w:p>
+            <w:pPr>
+              <w:jc w:val="right"/>
+            </w:pPr>
+            <w:r>
+              <w:rPr>
+                <w:b w:val="false"/>
+                <w:bCs w:val="false"/>
+                <w:sz w:val="20"/>
+                <w:szCs w:val="20"/>
               </w:rPr>
               <w:t xml:space="preserve">0,05 €/Go</w:t>
+            </w:r>
+          </w:p>
+        </w:tc>
+        <w:tc>
+          <w:tcPr>
+            <w:tcBorders>
+              <w:top w:val="single" w:color="CCCCCC" w:sz="1"/>
+              <w:left w:val="single" w:color="CCCCCC" w:sz="1"/>
+              <w:bottom w:val="single" w:color="CCCCCC" w:sz="1"/>
+              <w:right w:val="single" w:color="CCCCCC" w:sz="1"/>
+            </w:tcBorders>
+          </w:tcPr>
+          <w:p>
+            <w:pPr>
+              <w:jc w:val="right"/>
+            </w:pPr>
+            <w:r>
+              <w:rPr>
+                <w:b w:val="false"/>
+                <w:bCs w:val="false"/>
+                <w:sz w:val="20"/>
+                <w:szCs w:val="20"/>
+              </w:rPr>
+              <w:t xml:space="preserve">500,00 €</w:t>
             </w:r>
           </w:p>
         </w:tc>
@@ -458,10 +672,15 @@
             </w:tcBorders>
           </w:tcPr>
           <w:p>
-            <w:r>
-              <w:rPr>
-                <w:sz w:val="22"/>
-                <w:szCs w:val="22"/>
+            <w:pPr>
+              <w:jc w:val="left"/>
+            </w:pPr>
+            <w:r>
+              <w:rPr>
+                <w:b w:val="false"/>
+                <w:bCs w:val="false"/>
+                <w:sz w:val="20"/>
+                <w:szCs w:val="20"/>
               </w:rPr>
               <w:t xml:space="preserve">Support Premium 24/7</w:t>
             </w:r>
@@ -478,14 +697,64 @@
           </w:tcPr>
           <w:p>
             <w:pPr>
-              <w:jc w:val="right"/>
-            </w:pPr>
-            <w:r>
-              <w:rPr>
-                <w:sz w:val="22"/>
-                <w:szCs w:val="22"/>
+              <w:jc w:val="center"/>
+            </w:pPr>
+            <w:r>
+              <w:rPr>
+                <w:b w:val="false"/>
+                <w:bCs w:val="false"/>
+                <w:sz w:val="20"/>
+                <w:szCs w:val="20"/>
+              </w:rPr>
+              <w:t xml:space="preserve">12 mois</w:t>
+            </w:r>
+          </w:p>
+        </w:tc>
+        <w:tc>
+          <w:tcPr>
+            <w:tcBorders>
+              <w:top w:val="single" w:color="CCCCCC" w:sz="1"/>
+              <w:left w:val="single" w:color="CCCCCC" w:sz="1"/>
+              <w:bottom w:val="single" w:color="CCCCCC" w:sz="1"/>
+              <w:right w:val="single" w:color="CCCCCC" w:sz="1"/>
+            </w:tcBorders>
+          </w:tcPr>
+          <w:p>
+            <w:pPr>
+              <w:jc w:val="right"/>
+            </w:pPr>
+            <w:r>
+              <w:rPr>
+                <w:b w:val="false"/>
+                <w:bCs w:val="false"/>
+                <w:sz w:val="20"/>
+                <w:szCs w:val="20"/>
               </w:rPr>
               <w:t xml:space="preserve">850 €/mois</w:t>
+            </w:r>
+          </w:p>
+        </w:tc>
+        <w:tc>
+          <w:tcPr>
+            <w:tcBorders>
+              <w:top w:val="single" w:color="CCCCCC" w:sz="1"/>
+              <w:left w:val="single" w:color="CCCCCC" w:sz="1"/>
+              <w:bottom w:val="single" w:color="CCCCCC" w:sz="1"/>
+              <w:right w:val="single" w:color="CCCCCC" w:sz="1"/>
+            </w:tcBorders>
+          </w:tcPr>
+          <w:p>
+            <w:pPr>
+              <w:jc w:val="right"/>
+            </w:pPr>
+            <w:r>
+              <w:rPr>
+                <w:b w:val="false"/>
+                <w:bCs w:val="false"/>
+                <w:sz w:val="20"/>
+                <w:szCs w:val="20"/>
+              </w:rPr>
+              <w:t xml:space="preserve">10 200,00 €</w:t>
             </w:r>
           </w:p>
         </w:tc>
@@ -493,16 +762,19 @@
       <w:tr>
         <w:tc>
           <w:tcPr>
-            <w:gridSpan w:val="2"/>
-            <w:tcBorders>
-              <w:top w:val="single" w:color="CCCCCC" w:sz="1"/>
-              <w:left w:val="single" w:color="CCCCCC" w:sz="1"/>
-              <w:bottom w:val="single" w:color="CCCCCC" w:sz="1"/>
-              <w:right w:val="single" w:color="CCCCCC" w:sz="1"/>
-            </w:tcBorders>
-            <w:shd w:color="F0F0F0" w:val="solid"/>
-          </w:tcPr>
-          <w:p>
+            <w:gridSpan w:val="3"/>
+            <w:tcBorders>
+              <w:top w:val="single" w:color="CCCCCC" w:sz="1"/>
+              <w:left w:val="single" w:color="CCCCCC" w:sz="1"/>
+              <w:bottom w:val="single" w:color="CCCCCC" w:sz="1"/>
+              <w:right w:val="single" w:color="CCCCCC" w:sz="1"/>
+            </w:tcBorders>
+            <w:shd w:color="E8E8E8" w:val="solid"/>
+          </w:tcPr>
+          <w:p>
+            <w:pPr>
+              <w:jc w:val="right"/>
+            </w:pPr>
             <w:r>
               <w:rPr>
                 <w:b/>
@@ -510,7 +782,32 @@
                 <w:sz w:val="20"/>
                 <w:szCs w:val="20"/>
               </w:rPr>
-              <w:t xml:space="preserve">Remise volume</w:t>
+              <w:t xml:space="preserve">Total HT</w:t>
+            </w:r>
+          </w:p>
+        </w:tc>
+        <w:tc>
+          <w:tcPr>
+            <w:tcBorders>
+              <w:top w:val="single" w:color="CCCCCC" w:sz="1"/>
+              <w:left w:val="single" w:color="CCCCCC" w:sz="1"/>
+              <w:bottom w:val="single" w:color="CCCCCC" w:sz="1"/>
+              <w:right w:val="single" w:color="CCCCCC" w:sz="1"/>
+            </w:tcBorders>
+            <w:shd w:color="E8E8E8" w:val="solid"/>
+          </w:tcPr>
+          <w:p>
+            <w:pPr>
+              <w:jc w:val="right"/>
+            </w:pPr>
+            <w:r>
+              <w:rPr>
+                <w:b/>
+                <w:bCs/>
+                <w:sz w:val="20"/>
+                <w:szCs w:val="20"/>
+              </w:rPr>
+              <w:t xml:space="preserve">10 982,50 €</w:t>
             </w:r>
           </w:p>
         </w:tc>
@@ -518,21 +815,103 @@
       <w:tr>
         <w:tc>
           <w:tcPr>
-            <w:gridSpan w:val="2"/>
-            <w:tcBorders>
-              <w:top w:val="single" w:color="CCCCCC" w:sz="1"/>
-              <w:left w:val="single" w:color="CCCCCC" w:sz="1"/>
-              <w:bottom w:val="single" w:color="CCCCCC" w:sz="1"/>
-              <w:right w:val="single" w:color="CCCCCC" w:sz="1"/>
-            </w:tcBorders>
-          </w:tcPr>
-          <w:p>
-            <w:r>
-              <w:rPr>
-                <w:sz w:val="22"/>
-                <w:szCs w:val="22"/>
-              </w:rPr>
-              <w:t xml:space="preserve">Dès 10 000 €/mois de consommation</w:t>
+            <w:gridSpan w:val="3"/>
+            <w:tcBorders>
+              <w:top w:val="single" w:color="CCCCCC" w:sz="1"/>
+              <w:left w:val="single" w:color="CCCCCC" w:sz="1"/>
+              <w:bottom w:val="single" w:color="CCCCCC" w:sz="1"/>
+              <w:right w:val="single" w:color="CCCCCC" w:sz="1"/>
+            </w:tcBorders>
+          </w:tcPr>
+          <w:p>
+            <w:pPr>
+              <w:jc w:val="right"/>
+            </w:pPr>
+            <w:r>
+              <w:rPr>
+                <w:sz w:val="20"/>
+                <w:szCs w:val="20"/>
+              </w:rPr>
+              <w:t xml:space="preserve">TVA (20%)</w:t>
+            </w:r>
+          </w:p>
+        </w:tc>
+        <w:tc>
+          <w:tcPr>
+            <w:tcBorders>
+              <w:top w:val="single" w:color="CCCCCC" w:sz="1"/>
+              <w:left w:val="single" w:color="CCCCCC" w:sz="1"/>
+              <w:bottom w:val="single" w:color="CCCCCC" w:sz="1"/>
+              <w:right w:val="single" w:color="CCCCCC" w:sz="1"/>
+            </w:tcBorders>
+          </w:tcPr>
+          <w:p>
+            <w:pPr>
+              <w:jc w:val="right"/>
+            </w:pPr>
+            <w:r>
+              <w:rPr>
+                <w:b w:val="false"/>
+                <w:bCs w:val="false"/>
+                <w:sz w:val="20"/>
+                <w:szCs w:val="20"/>
+              </w:rPr>
+              <w:t xml:space="preserve">2 196,50 €</w:t>
+            </w:r>
+          </w:p>
+        </w:tc>
+      </w:tr>
+      <w:tr>
+        <w:tc>
+          <w:tcPr>
+            <w:gridSpan w:val="3"/>
+            <w:tcBorders>
+              <w:top w:val="single" w:color="CCCCCC" w:sz="1"/>
+              <w:left w:val="single" w:color="CCCCCC" w:sz="1"/>
+              <w:bottom w:val="single" w:color="CCCCCC" w:sz="1"/>
+              <w:right w:val="single" w:color="CCCCCC" w:sz="1"/>
+            </w:tcBorders>
+            <w:shd w:color="2B579A" w:val="solid"/>
+          </w:tcPr>
+          <w:p>
+            <w:pPr>
+              <w:jc w:val="right"/>
+            </w:pPr>
+            <w:r>
+              <w:rPr>
+                <w:b/>
+                <w:bCs/>
+                <w:color w:val="FFFFFF"/>
+                <w:sz w:val="20"/>
+                <w:szCs w:val="20"/>
+              </w:rPr>
+              <w:t xml:space="preserve">Total TTC</w:t>
+            </w:r>
+          </w:p>
+        </w:tc>
+        <w:tc>
+          <w:tcPr>
+            <w:tcBorders>
+              <w:top w:val="single" w:color="CCCCCC" w:sz="1"/>
+              <w:left w:val="single" w:color="CCCCCC" w:sz="1"/>
+              <w:bottom w:val="single" w:color="CCCCCC" w:sz="1"/>
+              <w:right w:val="single" w:color="CCCCCC" w:sz="1"/>
+            </w:tcBorders>
+            <w:shd w:color="2B579A" w:val="solid"/>
+          </w:tcPr>
+          <w:p>
+            <w:pPr>
+              <w:jc w:val="right"/>
+            </w:pPr>
+            <w:r>
+              <w:rPr>
+                <w:b/>
+                <w:bCs/>
+                <w:color w:val="FFFFFF"/>
+                <w:sz w:val="20"/>
+                <w:szCs w:val="20"/>
+              </w:rPr>
+              <w:t xml:space="preserve">13 179,00 €</w:t>
             </w:r>
           </w:p>
         </w:tc>
@@ -544,14 +923,9 @@
       </w:pPr>
     </w:p>
     <w:p>
-      <w:r>
-        <w:br w:type="page"/>
-      </w:r>
-    </w:p>
-    <w:p>
       <w:pPr>
         <w:pStyle w:val="Heading1"/>
-        <w:spacing w:after="200"/>
+        <w:spacing w:before="300"/>
       </w:pPr>
       <w:r>
         <w:rPr>
@@ -559,12 +933,12 @@
           <w:bCs/>
           <w:color w:val="2B579A"/>
         </w:rPr>
-        <w:t xml:space="preserve">4. Références</w:t>
-      </w:r>
-    </w:p>
-    <w:p>
-      <w:pPr>
-        <w:spacing w:after="400"/>
+        <w:t xml:space="preserve">Références</w:t>
+      </w:r>
+    </w:p>
+    <w:p>
+      <w:pPr>
+        <w:spacing w:after="300"/>
       </w:pPr>
       <w:r>
         <w:rPr>
@@ -577,7 +951,7 @@
     <w:p>
       <w:pPr>
         <w:pStyle w:val="Heading1"/>
-        <w:spacing w:after="200" w:before="400"/>
+        <w:spacing w:before="300"/>
       </w:pPr>
       <w:r>
         <w:rPr>
@@ -585,39 +959,16 @@
           <w:bCs/>
           <w:color w:val="2B579A"/>
         </w:rPr>
-        <w:t xml:space="preserve">5. Conclusion</w:t>
-      </w:r>
-    </w:p>
-    <w:p>
-      <w:pPr>
-        <w:spacing w:after="400"/>
-      </w:pPr>
+        <w:t xml:space="preserve">Conclusion</w:t>
+      </w:r>
+    </w:p>
+    <w:p>
       <w:r>
         <w:rPr>
           <w:sz w:val="22"/>
           <w:szCs w:val="22"/>
         </w:rPr>
         <w:t xml:space="preserve">+++INS fragments.conclusion.body+++</w:t>
-      </w:r>
-    </w:p>
-    <w:p>
-      <w:pPr>
-        <w:spacing w:before="800"/>
-      </w:pPr>
-    </w:p>
-    <w:p>
-      <w:pPr>
-        <w:jc w:val="center"/>
-      </w:pPr>
-      <w:r>
-        <w:rPr>
-          <w:i/>
-          <w:iCs/>
-          <w:color w:val="999999"/>
-          <w:sz w:val="22"/>
-          <w:szCs w:val="22"/>
-        </w:rPr>
-        <w:t xml:space="preserve">LINAGORA — LinCloud Souverain</w:t>
       </w:r>
     </w:p>
     <w:sectPr>

</xml_diff>